<commit_message>
Handleidingen: nieuwe schermafbeeldingen met verzonnen namen
Alle schermafbeeldingen waarop panelnamen of het oude coördinatorscherm te
zien waren, opnieuw gemaakt (coördinator: afbeelding 2-7 en 9; beoordelaars:
afbeelding 5, 12, 13 en 14), in Word en HTML. Alleen de opdrachtgever staat
er nog bij naam in.

Co-Authored-By: Claude Opus 5.5 <noreply@anthropic.com>
Claude-Session: https://claude.ai/code/session_01Jx3jgACt2JiVRfqwELHUjU
</commit_message>
<xml_diff>
--- a/handleidingen/Handleiding_beoordelaars_levertekorten.docx
+++ b/handleidingen/Handleiding_beoordelaars_levertekorten.docx
@@ -1469,7 +1469,7 @@
               <w:spacing w:after="0"/>
             </w:pPr>
             <w:r>
-              <w:t xml:space="preserve">Hoeveel regels je hebt beoordeeld (bijvoorbeeld "140 van 299"), en bij welk tekort je bent ("Tekort 38 van 96").</w:t>
+              <w:t xml:space="preserve">Hoeveel regels je hebt beoordeeld (bijvoorbeeld "147 van 299"), en bij welk tekort je bent ("Tekort 39 van 96").</w:t>
             </w:r>
           </w:p>
         </w:tc>
@@ -3452,7 +3452,7 @@
       <w:r>
         <w:drawing>
           <wp:inline distT="0" distB="0" distL="0" distR="0">
-            <wp:extent cx="6096000" cy="2409825"/>
+            <wp:extent cx="6096000" cy="2416175"/>
             <wp:effectExtent t="0" r="0" b="0" l="0"/>
             <wp:docPr id="1" name="b15_klaar.png" descr="Het eindscherm." title="Het eindscherm."/>
             <wp:cNvGraphicFramePr>
@@ -3477,7 +3477,7 @@
                   <pic:spPr bwMode="auto">
                     <a:xfrm>
                       <a:off x="0" y="0"/>
-                      <a:ext cx="6096000" cy="2409825"/>
+                      <a:ext cx="6096000" cy="2416175"/>
                     </a:xfrm>
                     <a:prstGeom prst="rect">
                       <a:avLst/>

</xml_diff>

<commit_message>
Regels die al in OA staan: tonen ter informatie, niet beoordelen
- kern: alInOA() (niveau 'Al gepubliceerd …') en teBeoordelen(); status 'inoa' (Staat al in OA)
  in berekenUitkomsten; tellingen in beoordelingNaarJson alleen over te beoordelen regels
- Beoordelaarsscherm: zulke regels grijs met '✓ Staat al in OA', zonder knoppen (data-oa);
  voortgang, filter 'open', stapweergave en eindscherm tellen ze niet mee;
  Volgende tekort slaat tekorten over waar alles al in OA staat
- Coördinator: voortgang per beoordelaar over te beoordelen regels, status in Overzicht en Alle regels
- Tests (kern + browser), handleidingen (Word + HTML), README, VOORTGANG en CLAUDE.md bijgewerkt

Co-Authored-By: Claude Opus 5.5 <noreply@anthropic.com>
Claude-Session: https://claude.ai/code/session_01ChVedcKSyHjhqt5ksW6Q7S
</commit_message>
<xml_diff>
--- a/handleidingen/Handleiding_beoordelaars_levertekorten.docx
+++ b/handleidingen/Handleiding_beoordelaars_levertekorten.docx
@@ -1469,7 +1469,7 @@
               <w:spacing w:after="0"/>
             </w:pPr>
             <w:r>
-              <w:t xml:space="preserve">Hoeveel regels je hebt beoordeeld (bijvoorbeeld "147 van 299"), en bij welk tekort je bent ("Tekort 39 van 96").</w:t>
+              <w:t xml:space="preserve">Hoeveel regels je hebt beoordeeld (bijvoorbeeld "147 van 255"), en bij welk tekort je bent ("Tekort 39 van 96").</w:t>
             </w:r>
           </w:p>
         </w:tc>
@@ -2646,6 +2646,49 @@
       </w:r>
       <w:r>
         <w:t xml:space="preserve"> klikken voor de afzet, de backorder, de ATC-code en of er al een advies is gepubliceerd.</w:t>
+      </w:r>
+    </w:p>
+    <w:p>
+      <w:pPr>
+        <w:pStyle w:val="Heading2"/>
+      </w:pPr>
+      <w:r>
+        <w:t xml:space="preserve">Alternatieven die al in OA staan</w:t>
+      </w:r>
+    </w:p>
+    <w:p>
+      <w:r>
+        <w:t xml:space="preserve">Sommige alternatieven zijn al eerder gepubliceerd en staan al in OA. Die zie je in een grijs vak met </w:t>
+      </w:r>
+      <w:r>
+        <w:rPr>
+          <w:b/>
+          <w:bCs/>
+        </w:rPr>
+        <w:t xml:space="preserve">✓ Staat al in OA</w:t>
+      </w:r>
+      <w:r>
+        <w:t xml:space="preserve">, zonder knoppen. Je hoeft ze niet te beoordelen: OA kan geen adviezen verwijderen, dus een oordeel verandert er niets aan. Ze staan erbij zodat je ziet wat er al geadviseerd wordt. Beoordeel alleen de </w:t>
+      </w:r>
+      <w:r>
+        <w:rPr>
+          <w:b/>
+          <w:bCs/>
+        </w:rPr>
+        <w:t xml:space="preserve">nieuwe</w:t>
+      </w:r>
+      <w:r>
+        <w:t xml:space="preserve"> alternatieven bij dat tekort; die worden aan het advies in OA toegevoegd. Staan bij een tekort alle alternatieven al in OA, dan slaat </w:t>
+      </w:r>
+      <w:r>
+        <w:rPr>
+          <w:b/>
+          <w:bCs/>
+        </w:rPr>
+        <w:t xml:space="preserve">Volgende tekort</w:t>
+      </w:r>
+      <w:r>
+        <w:t xml:space="preserve"> dat tekort over. Je kunt er wel zelf een ander alternatief voorstellen (hoofdstuk 6).</w:t>
       </w:r>
     </w:p>
     <w:p>

</xml_diff>

<commit_message>
Handleidingen: schermafbeeldingen vernieuwd (255 regels, 'Staat al in OA', Opzoeken)
- Beoordelaars: afbeeldingen 5-16 opnieuw; nieuw afb. 8 (alternatief dat al in OA staat,
  zonder knoppen); voorbeeldtekst "145 van 255" en "Tekort 46 van 96"
- Coördinator: afbeeldingen 2-10 opnieuw (met tabblad Opzoeken); nieuw afb. 7 (Opzoeken)
- tools/schermafbeeldingen.js: maakt alle schermafbeeldingen met verzonnen gegevens in de
  nagebootste Supabase (uitvoer in handleidingen/afbeeldingen-nieuw, niet in git)
- CLAUDE.md en VOORTGANG.md bijgewerkt

Co-Authored-By: Claude Opus 5.5 <noreply@anthropic.com>
Claude-Session: https://claude.ai/code/session_01UwausAT6nnUTxQyeikk8JH
</commit_message>
<xml_diff>
--- a/handleidingen/Handleiding_beoordelaars_levertekorten.docx
+++ b/handleidingen/Handleiding_beoordelaars_levertekorten.docx
@@ -1469,7 +1469,7 @@
               <w:spacing w:after="0"/>
             </w:pPr>
             <w:r>
-              <w:t xml:space="preserve">Hoeveel regels je hebt beoordeeld (bijvoorbeeld "147 van 255"), en bij welk tekort je bent ("Tekort 39 van 96").</w:t>
+              <w:t xml:space="preserve">Hoeveel regels je hebt beoordeeld (bijvoorbeeld "145 van 255"), en bij welk tekort je bent ("Tekort 46 van 96").</w:t>
             </w:r>
           </w:p>
         </w:tc>
@@ -1938,7 +1938,7 @@
       <w:r>
         <w:drawing>
           <wp:inline distT="0" distB="0" distL="0" distR="0">
-            <wp:extent cx="6096000" cy="1647825"/>
+            <wp:extent cx="6096000" cy="1587500"/>
             <wp:effectExtent t="0" r="0" b="0" l="0"/>
             <wp:docPr id="1" name="b07_akkoord.png" descr="Gekozen voor Akkoord: de knop wordt blauw. Een toelichting kan via &quot;+ Toelichting toevoegen&quot;." title="Gekozen voor Akkoord: de knop wordt blauw. Een toelichting kan via &quot;+ Toelichting toevoegen&quot;."/>
             <wp:cNvGraphicFramePr>
@@ -1963,7 +1963,7 @@
                   <pic:spPr bwMode="auto">
                     <a:xfrm>
                       <a:off x="0" y="0"/>
-                      <a:ext cx="6096000" cy="1647825"/>
+                      <a:ext cx="6096000" cy="1587500"/>
                     </a:xfrm>
                     <a:prstGeom prst="rect">
                       <a:avLst/>
@@ -2001,7 +2001,7 @@
       <w:r>
         <w:drawing>
           <wp:inline distT="0" distB="0" distL="0" distR="0">
-            <wp:extent cx="6096000" cy="1819275"/>
+            <wp:extent cx="6096000" cy="1900767"/>
             <wp:effectExtent t="0" r="0" b="0" l="0"/>
             <wp:docPr id="1" name="b05_niet_akkoord_toelichting.png" descr="Bij Niet akkoord (en Bespreken) verschijnt direct een veld voor de toelichting." title="Bij Niet akkoord (en Bespreken) verschijnt direct een veld voor de toelichting."/>
             <wp:cNvGraphicFramePr>
@@ -2026,7 +2026,7 @@
                   <pic:spPr bwMode="auto">
                     <a:xfrm>
                       <a:off x="0" y="0"/>
-                      <a:ext cx="6096000" cy="1819275"/>
+                      <a:ext cx="6096000" cy="1900767"/>
                     </a:xfrm>
                     <a:prstGeom prst="rect">
                       <a:avLst/>
@@ -2693,19 +2693,6 @@
     </w:p>
     <w:p>
       <w:pPr>
-        <w:pStyle w:val="Heading1"/>
-      </w:pPr>
-      <w:r>
-        <w:t xml:space="preserve">5. Naar het volgende tekort</w:t>
-      </w:r>
-    </w:p>
-    <w:p>
-      <w:r>
-        <w:t xml:space="preserve">Onderaan het scherm staat altijd een balk met knoppen.</w:t>
-      </w:r>
-    </w:p>
-    <w:p>
-      <w:pPr>
         <w:keepNext/>
         <w:spacing w:after="60" w:before="160"/>
         <w:jc w:val="center"/>
@@ -2713,7 +2700,83 @@
       <w:r>
         <w:drawing>
           <wp:inline distT="0" distB="0" distL="0" distR="0">
-            <wp:extent cx="6096000" cy="409575"/>
+            <wp:extent cx="6096000" cy="3022600"/>
+            <wp:effectExtent t="0" r="0" b="0" l="0"/>
+            <wp:docPr id="227" name="b08-staat-al-in-oa.png" descr="Een alternatief dat al in OA staat (grijs, zonder knoppen) en daaronder een nieuw alternatief dat je wel beoordeelt." title="Een alternatief dat al in OA staat (grijs, zonder knoppen) en daaronder een nieuw alternatief dat je wel beoordeelt."/>
+            <wp:cNvGraphicFramePr>
+              <a:graphicFrameLocks xmlns:a="http://schemas.openxmlformats.org/drawingml/2006/main" noChangeAspect="1"/>
+            </wp:cNvGraphicFramePr>
+            <a:graphic xmlns:a="http://schemas.openxmlformats.org/drawingml/2006/main">
+              <a:graphicData uri="http://schemas.openxmlformats.org/drawingml/2006/picture">
+                <pic:pic xmlns:pic="http://schemas.openxmlformats.org/drawingml/2006/picture">
+                  <pic:nvPicPr>
+                    <pic:cNvPr id="0" name="" descr=""/>
+                    <pic:cNvPicPr>
+                      <a:picLocks noChangeAspect="1" noChangeArrowheads="1"/>
+                    </pic:cNvPicPr>
+                  </pic:nvPicPr>
+                  <pic:blipFill>
+                    <a:blip r:embed="rId27" cstate="none"/>
+                    <a:srcRect/>
+                    <a:stretch>
+                      <a:fillRect/>
+                    </a:stretch>
+                  </pic:blipFill>
+                  <pic:spPr bwMode="auto">
+                    <a:xfrm>
+                      <a:off x="0" y="0"/>
+                      <a:ext cx="6096000" cy="3022600"/>
+                    </a:xfrm>
+                    <a:prstGeom prst="rect">
+                      <a:avLst/>
+                    </a:prstGeom>
+                  </pic:spPr>
+                </pic:pic>
+              </a:graphicData>
+            </a:graphic>
+          </wp:inline>
+        </w:drawing>
+      </w:r>
+    </w:p>
+    <w:p>
+      <w:pPr>
+        <w:spacing w:after="220"/>
+        <w:jc w:val="center"/>
+      </w:pPr>
+      <w:r>
+        <w:rPr>
+          <w:i/>
+          <w:iCs/>
+          <w:color w:val="595959"/>
+          <w:sz w:val="18"/>
+          <w:szCs w:val="18"/>
+        </w:rPr>
+        <w:t xml:space="preserve">Afbeelding 8. Een alternatief dat al in OA staat (grijs, zonder knoppen) en daaronder een nieuw alternatief dat je wel beoordeelt.</w:t>
+      </w:r>
+    </w:p>
+    <w:p>
+      <w:pPr>
+        <w:pStyle w:val="Heading1"/>
+      </w:pPr>
+      <w:r>
+        <w:t xml:space="preserve">5. Naar het volgende tekort</w:t>
+      </w:r>
+    </w:p>
+    <w:p>
+      <w:r>
+        <w:t xml:space="preserve">Onderaan het scherm staat altijd een balk met knoppen.</w:t>
+      </w:r>
+    </w:p>
+    <w:p>
+      <w:pPr>
+        <w:keepNext/>
+        <w:spacing w:after="60" w:before="160"/>
+        <w:jc w:val="center"/>
+      </w:pPr>
+      <w:r>
+        <w:drawing>
+          <wp:inline distT="0" distB="0" distL="0" distR="0">
+            <wp:extent cx="6096000" cy="292100"/>
             <wp:effectExtent t="0" r="0" b="0" l="0"/>
             <wp:docPr id="1" name="b06_onderbalk_overslaan.png" descr="Nog niet alles beoordeeld: de knop heet &quot;Overslaan, later doen&quot;." title="Nog niet alles beoordeeld: de knop heet &quot;Overslaan, later doen&quot;."/>
             <wp:cNvGraphicFramePr>
@@ -2738,7 +2801,7 @@
                   <pic:spPr bwMode="auto">
                     <a:xfrm>
                       <a:off x="0" y="0"/>
-                      <a:ext cx="6096000" cy="409575"/>
+                      <a:ext cx="6096000" cy="292100"/>
                     </a:xfrm>
                     <a:prstGeom prst="rect">
                       <a:avLst/>
@@ -2764,7 +2827,7 @@
           <w:sz w:val="18"/>
           <w:szCs w:val="18"/>
         </w:rPr>
-        <w:t xml:space="preserve">Afbeelding 8. Nog niet alles beoordeeld: de knop heet "Overslaan, later doen".</w:t>
+        <w:t xml:space="preserve">Afbeelding 9. Nog niet alles beoordeeld: de knop heet "Overslaan, later doen".</w:t>
       </w:r>
     </w:p>
     <w:p>
@@ -2776,7 +2839,7 @@
       <w:r>
         <w:drawing>
           <wp:inline distT="0" distB="0" distL="0" distR="0">
-            <wp:extent cx="6096000" cy="409575"/>
+            <wp:extent cx="6096000" cy="292100"/>
             <wp:effectExtent t="0" r="0" b="0" l="0"/>
             <wp:docPr id="1" name="b08_onderbalk_volgende.png" descr="Alles bij dit tekort beoordeeld: de knop wordt blauw en heet &quot;Volgende tekort&quot;." title="Alles bij dit tekort beoordeeld: de knop wordt blauw en heet &quot;Volgende tekort&quot;."/>
             <wp:cNvGraphicFramePr>
@@ -2801,7 +2864,7 @@
                   <pic:spPr bwMode="auto">
                     <a:xfrm>
                       <a:off x="0" y="0"/>
-                      <a:ext cx="6096000" cy="409575"/>
+                      <a:ext cx="6096000" cy="292100"/>
                     </a:xfrm>
                     <a:prstGeom prst="rect">
                       <a:avLst/>
@@ -2827,7 +2890,7 @@
           <w:sz w:val="18"/>
           <w:szCs w:val="18"/>
         </w:rPr>
-        <w:t xml:space="preserve">Afbeelding 9. Alles bij dit tekort beoordeeld: de knop wordt blauw en heet "Volgende tekort".</w:t>
+        <w:t xml:space="preserve">Afbeelding 10. Alles bij dit tekort beoordeeld: de knop wordt blauw en heet "Volgende tekort".</w:t>
       </w:r>
     </w:p>
     <w:p>
@@ -3011,7 +3074,7 @@
       <w:r>
         <w:drawing>
           <wp:inline distT="0" distB="0" distL="0" distR="0">
-            <wp:extent cx="6096000" cy="2247900"/>
+            <wp:extent cx="6096000" cy="2197100"/>
             <wp:effectExtent t="0" r="0" b="0" l="0"/>
             <wp:docPr id="1" name="b11_voorstel_zoeken.png" descr="Zoeken in de Z-index." title="Zoeken in de Z-index."/>
             <wp:cNvGraphicFramePr>
@@ -3036,7 +3099,7 @@
                   <pic:spPr bwMode="auto">
                     <a:xfrm>
                       <a:off x="0" y="0"/>
-                      <a:ext cx="6096000" cy="2247900"/>
+                      <a:ext cx="6096000" cy="2197100"/>
                     </a:xfrm>
                     <a:prstGeom prst="rect">
                       <a:avLst/>
@@ -3062,7 +3125,7 @@
           <w:sz w:val="18"/>
           <w:szCs w:val="18"/>
         </w:rPr>
-        <w:t xml:space="preserve">Afbeelding 10. Zoeken in de Z-index.</w:t>
+        <w:t xml:space="preserve">Afbeelding 11. Zoeken in de Z-index.</w:t>
       </w:r>
     </w:p>
     <w:p>
@@ -3074,7 +3137,7 @@
       <w:r>
         <w:drawing>
           <wp:inline distT="0" distB="0" distL="0" distR="0">
-            <wp:extent cx="6096000" cy="2428875"/>
+            <wp:extent cx="6096000" cy="2383367"/>
             <wp:effectExtent t="0" r="0" b="0" l="0"/>
             <wp:docPr id="1" name="b12_voorstel_gekozen.png" descr="Na het kiezen zie je het gekozen PRK. De app waarschuwt als iets afwijkt, bijvoorbeeld de toedieningsweg." title="Na het kiezen zie je het gekozen PRK. De app waarschuwt als iets afwijkt, bijvoorbeeld de toedieningsweg."/>
             <wp:cNvGraphicFramePr>
@@ -3099,7 +3162,7 @@
                   <pic:spPr bwMode="auto">
                     <a:xfrm>
                       <a:off x="0" y="0"/>
-                      <a:ext cx="6096000" cy="2428875"/>
+                      <a:ext cx="6096000" cy="2383367"/>
                     </a:xfrm>
                     <a:prstGeom prst="rect">
                       <a:avLst/>
@@ -3125,7 +3188,7 @@
           <w:sz w:val="18"/>
           <w:szCs w:val="18"/>
         </w:rPr>
-        <w:t xml:space="preserve">Afbeelding 11. Na het kiezen zie je het gekozen PRK. De app waarschuwt als iets afwijkt, bijvoorbeeld de toedieningsweg.</w:t>
+        <w:t xml:space="preserve">Afbeelding 12. Na het kiezen zie je het gekozen PRK. De app waarschuwt als iets afwijkt, bijvoorbeeld de toedieningsweg.</w:t>
       </w:r>
     </w:p>
     <w:p>
@@ -3292,7 +3355,7 @@
           <w:sz w:val="18"/>
           <w:szCs w:val="18"/>
         </w:rPr>
-        <w:t xml:space="preserve">Afbeelding 12. De lijstweergave. Met "Stap voor stap beoordelen" ga je terug.</w:t>
+        <w:t xml:space="preserve">Afbeelding 13. De lijstweergave. Met "Stap voor stap beoordelen" ga je terug.</w:t>
       </w:r>
     </w:p>
     <w:p>
@@ -3470,7 +3533,7 @@
           <w:sz w:val="18"/>
           <w:szCs w:val="18"/>
         </w:rPr>
-        <w:t xml:space="preserve">Afbeelding 13. Het menu "Meer".</w:t>
+        <w:t xml:space="preserve">Afbeelding 14. Het menu "Meer".</w:t>
       </w:r>
     </w:p>
     <w:p>
@@ -3495,7 +3558,7 @@
       <w:r>
         <w:drawing>
           <wp:inline distT="0" distB="0" distL="0" distR="0">
-            <wp:extent cx="6096000" cy="2416175"/>
+            <wp:extent cx="6096000" cy="2419350"/>
             <wp:effectExtent t="0" r="0" b="0" l="0"/>
             <wp:docPr id="1" name="b15_klaar.png" descr="Het eindscherm." title="Het eindscherm."/>
             <wp:cNvGraphicFramePr>
@@ -3520,7 +3583,7 @@
                   <pic:spPr bwMode="auto">
                     <a:xfrm>
                       <a:off x="0" y="0"/>
-                      <a:ext cx="6096000" cy="2416175"/>
+                      <a:ext cx="6096000" cy="2419350"/>
                     </a:xfrm>
                     <a:prstGeom prst="rect">
                       <a:avLst/>
@@ -3546,7 +3609,7 @@
           <w:sz w:val="18"/>
           <w:szCs w:val="18"/>
         </w:rPr>
-        <w:t xml:space="preserve">Afbeelding 14. Het eindscherm.</w:t>
+        <w:t xml:space="preserve">Afbeelding 15. Het eindscherm.</w:t>
       </w:r>
     </w:p>
     <w:p>
@@ -3596,7 +3659,7 @@
       <w:r>
         <w:drawing>
           <wp:inline distT="0" distB="0" distL="0" distR="0">
-            <wp:extent cx="2466975" cy="5334000"/>
+            <wp:extent cx="2466975" cy="5338787"/>
             <wp:effectExtent t="0" r="0" b="0" l="0"/>
             <wp:docPr id="1" name="b16_telefoon.png" descr="De app op een telefoon." title="De app op een telefoon."/>
             <wp:cNvGraphicFramePr>
@@ -3621,7 +3684,7 @@
                   <pic:spPr bwMode="auto">
                     <a:xfrm>
                       <a:off x="0" y="0"/>
-                      <a:ext cx="2466975" cy="5334000"/>
+                      <a:ext cx="2466975" cy="5338787"/>
                     </a:xfrm>
                     <a:prstGeom prst="rect">
                       <a:avLst/>
@@ -3647,7 +3710,7 @@
           <w:sz w:val="18"/>
           <w:szCs w:val="18"/>
         </w:rPr>
-        <w:t xml:space="preserve">Afbeelding 15. De app op een telefoon.</w:t>
+        <w:t xml:space="preserve">Afbeelding 16. De app op een telefoon.</w:t>
       </w:r>
     </w:p>
     <w:p>

</xml_diff>